<commit_message>
Docs: describe registry with 2 versions and champion alias on v2; rebuild report
Co-Authored-By: Claude Sonnet 5.5 <noreply@anthropic.com>
</commit_message>
<xml_diff>
--- a/docs/REPORT.docx
+++ b/docs/REPORT.docx
@@ -1760,12 +1760,54 @@
       </w:r>
     </w:p>
     <w:p>
+      <w:pPr>
+        <w:jc w:val="center"/>
+      </w:pPr>
+      <w:r>
+        <w:drawing>
+          <wp:inline xmlns:a="http://schemas.openxmlformats.org/drawingml/2006/main" xmlns:pic="http://schemas.openxmlformats.org/drawingml/2006/picture">
+            <wp:extent cx="5486400" cy="3579897"/>
+            <wp:docPr id="6" name="Picture 6"/>
+            <wp:cNvGraphicFramePr>
+              <a:graphicFrameLocks noChangeAspect="1"/>
+            </wp:cNvGraphicFramePr>
+            <a:graphic>
+              <a:graphicData uri="http://schemas.openxmlformats.org/drawingml/2006/picture">
+                <pic:pic>
+                  <pic:nvPicPr>
+                    <pic:cNvPr id="0" name="eda_notebook.png"/>
+                    <pic:cNvPicPr/>
+                  </pic:nvPicPr>
+                  <pic:blipFill>
+                    <a:blip r:embed="rId14"/>
+                    <a:stretch>
+                      <a:fillRect/>
+                    </a:stretch>
+                  </pic:blipFill>
+                  <pic:spPr>
+                    <a:xfrm>
+                      <a:off x="0" y="0"/>
+                      <a:ext cx="5486400" cy="3579897"/>
+                    </a:xfrm>
+                    <a:prstGeom prst="rect"/>
+                  </pic:spPr>
+                </pic:pic>
+              </a:graphicData>
+            </a:graphic>
+          </wp:inline>
+        </w:drawing>
+      </w:r>
+    </w:p>
+    <w:p>
+      <w:pPr>
+        <w:jc w:val="center"/>
+      </w:pPr>
       <w:r>
         <w:rPr>
           <w:i/>
-          <w:color w:val="888888"/>
+          <w:sz w:val="18"/>
         </w:rPr>
-        <w:t>[Screenshot pending: eda_notebook.png]</w:t>
+        <w:t>Screenshot: eda_notebook.png</w:t>
       </w:r>
     </w:p>
     <w:p>
@@ -3908,7 +3950,7 @@
         <w:drawing>
           <wp:inline xmlns:a="http://schemas.openxmlformats.org/drawingml/2006/main" xmlns:pic="http://schemas.openxmlformats.org/drawingml/2006/picture">
             <wp:extent cx="3657600" cy="3251200"/>
-            <wp:docPr id="6" name="Picture 6"/>
+            <wp:docPr id="7" name="Picture 7"/>
             <wp:cNvGraphicFramePr>
               <a:graphicFrameLocks noChangeAspect="1"/>
             </wp:cNvGraphicFramePr>
@@ -3920,7 +3962,7 @@
                     <pic:cNvPicPr/>
                   </pic:nvPicPr>
                   <pic:blipFill>
-                    <a:blip r:embed="rId14"/>
+                    <a:blip r:embed="rId15"/>
                     <a:stretch>
                       <a:fillRect/>
                     </a:stretch>
@@ -3959,7 +4001,7 @@
         <w:drawing>
           <wp:inline xmlns:a="http://schemas.openxmlformats.org/drawingml/2006/main" xmlns:pic="http://schemas.openxmlformats.org/drawingml/2006/picture">
             <wp:extent cx="3657600" cy="2926080"/>
-            <wp:docPr id="7" name="Picture 7"/>
+            <wp:docPr id="8" name="Picture 8"/>
             <wp:cNvGraphicFramePr>
               <a:graphicFrameLocks noChangeAspect="1"/>
             </wp:cNvGraphicFramePr>
@@ -3971,7 +4013,7 @@
                     <pic:cNvPicPr/>
                   </pic:nvPicPr>
                   <pic:blipFill>
-                    <a:blip r:embed="rId15"/>
+                    <a:blip r:embed="rId16"/>
                     <a:stretch>
                       <a:fillRect/>
                     </a:stretch>
@@ -4060,7 +4102,7 @@
         <w:drawing>
           <wp:inline xmlns:a="http://schemas.openxmlformats.org/drawingml/2006/main" xmlns:pic="http://schemas.openxmlformats.org/drawingml/2006/picture">
             <wp:extent cx="3657600" cy="3048000"/>
-            <wp:docPr id="8" name="Picture 8"/>
+            <wp:docPr id="9" name="Picture 9"/>
             <wp:cNvGraphicFramePr>
               <a:graphicFrameLocks noChangeAspect="1"/>
             </wp:cNvGraphicFramePr>
@@ -4072,7 +4114,7 @@
                     <pic:cNvPicPr/>
                   </pic:nvPicPr>
                   <pic:blipFill>
-                    <a:blip r:embed="rId16"/>
+                    <a:blip r:embed="rId17"/>
                     <a:stretch>
                       <a:fillRect/>
                     </a:stretch>
@@ -4260,6 +4302,87 @@
       </w:r>
       <w:r>
         <w:t>.</w:t>
+      </w:r>
+    </w:p>
+    <w:p>
+      <w:pPr>
+        <w:pStyle w:val="Heading2"/>
+      </w:pPr>
+      <w:r>
+        <w:t>5.2 Model registry and versioning</w:t>
+      </w:r>
+    </w:p>
+    <w:p>
+      <w:r>
+        <w:t xml:space="preserve">Each training run registers its best model under the name </w:t>
+      </w:r>
+      <w:r>
+        <w:rPr>
+          <w:rFonts w:ascii="Consolas" w:hAnsi="Consolas"/>
+          <w:sz w:val="19"/>
+        </w:rPr>
+        <w:t>heart-disease-classifier</w:t>
+      </w:r>
+      <w:r>
+        <w:t xml:space="preserve">, which creates a new version. I trained twice, so the registry shows </w:t>
+      </w:r>
+      <w:r>
+        <w:rPr>
+          <w:b/>
+        </w:rPr>
+        <w:t>2 versions</w:t>
+      </w:r>
+      <w:r>
+        <w:t xml:space="preserve"> of </w:t>
+      </w:r>
+      <w:r>
+        <w:rPr>
+          <w:rFonts w:ascii="Consolas" w:hAnsi="Consolas"/>
+          <w:sz w:val="19"/>
+        </w:rPr>
+        <w:t>heart-disease-classifier</w:t>
+      </w:r>
+      <w:r>
+        <w:t xml:space="preserve">, one per training run. After each run the </w:t>
+      </w:r>
+      <w:r>
+        <w:rPr>
+          <w:rFonts w:ascii="Consolas" w:hAnsi="Consolas"/>
+          <w:sz w:val="19"/>
+        </w:rPr>
+        <w:t>champion</w:t>
+      </w:r>
+      <w:r>
+        <w:t xml:space="preserve"> alias is moved to the newly registered version, so it now points to the latest version (</w:t>
+      </w:r>
+      <w:r>
+        <w:rPr>
+          <w:b/>
+        </w:rPr>
+        <w:t>v2</w:t>
+      </w:r>
+      <w:r>
+        <w:t xml:space="preserve">) and v1 stays available as the earlier version. This demonstrates both versioning (every run is kept and traceable to its MLflow run) and alias promotion (consumers ask for "champion" instead of a hard-coded version number, and promotion or rollback is just moving the alias). The version number is also written to </w:t>
+      </w:r>
+      <w:r>
+        <w:rPr>
+          <w:rFonts w:ascii="Consolas" w:hAnsi="Consolas"/>
+          <w:sz w:val="19"/>
+        </w:rPr>
+        <w:t>models/metadata.json</w:t>
+      </w:r>
+      <w:r>
+        <w:t xml:space="preserve"> and returned as </w:t>
+      </w:r>
+      <w:r>
+        <w:rPr>
+          <w:rFonts w:ascii="Consolas" w:hAnsi="Consolas"/>
+          <w:sz w:val="19"/>
+        </w:rPr>
+        <w:t>model_version</w:t>
+      </w:r>
+      <w:r>
+        <w:t xml:space="preserve"> by the API.</w:t>
       </w:r>
     </w:p>
     <w:p>
@@ -5044,30 +5167,156 @@
       </w:r>
     </w:p>
     <w:p>
+      <w:pPr>
+        <w:jc w:val="center"/>
+      </w:pPr>
+      <w:r>
+        <w:drawing>
+          <wp:inline xmlns:a="http://schemas.openxmlformats.org/drawingml/2006/main" xmlns:pic="http://schemas.openxmlformats.org/drawingml/2006/picture">
+            <wp:extent cx="5486400" cy="2744632"/>
+            <wp:docPr id="10" name="Picture 10"/>
+            <wp:cNvGraphicFramePr>
+              <a:graphicFrameLocks noChangeAspect="1"/>
+            </wp:cNvGraphicFramePr>
+            <a:graphic>
+              <a:graphicData uri="http://schemas.openxmlformats.org/drawingml/2006/picture">
+                <pic:pic>
+                  <pic:nvPicPr>
+                    <pic:cNvPr id="0" name="mlflow_runs.png"/>
+                    <pic:cNvPicPr/>
+                  </pic:nvPicPr>
+                  <pic:blipFill>
+                    <a:blip r:embed="rId18"/>
+                    <a:stretch>
+                      <a:fillRect/>
+                    </a:stretch>
+                  </pic:blipFill>
+                  <pic:spPr>
+                    <a:xfrm>
+                      <a:off x="0" y="0"/>
+                      <a:ext cx="5486400" cy="2744632"/>
+                    </a:xfrm>
+                    <a:prstGeom prst="rect"/>
+                  </pic:spPr>
+                </pic:pic>
+              </a:graphicData>
+            </a:graphic>
+          </wp:inline>
+        </w:drawing>
+      </w:r>
+    </w:p>
+    <w:p>
+      <w:pPr>
+        <w:jc w:val="center"/>
+      </w:pPr>
       <w:r>
         <w:rPr>
           <w:i/>
-          <w:color w:val="888888"/>
+          <w:sz w:val="18"/>
         </w:rPr>
-        <w:t>[Screenshot pending: mlflow_runs.png]</w:t>
+        <w:t>Screenshot: mlflow_runs.png</w:t>
       </w:r>
     </w:p>
     <w:p>
+      <w:pPr>
+        <w:jc w:val="center"/>
+      </w:pPr>
+      <w:r>
+        <w:drawing>
+          <wp:inline xmlns:a="http://schemas.openxmlformats.org/drawingml/2006/main" xmlns:pic="http://schemas.openxmlformats.org/drawingml/2006/picture">
+            <wp:extent cx="5486400" cy="2746091"/>
+            <wp:docPr id="11" name="Picture 11"/>
+            <wp:cNvGraphicFramePr>
+              <a:graphicFrameLocks noChangeAspect="1"/>
+            </wp:cNvGraphicFramePr>
+            <a:graphic>
+              <a:graphicData uri="http://schemas.openxmlformats.org/drawingml/2006/picture">
+                <pic:pic>
+                  <pic:nvPicPr>
+                    <pic:cNvPr id="0" name="mlflow_best_run.png"/>
+                    <pic:cNvPicPr/>
+                  </pic:nvPicPr>
+                  <pic:blipFill>
+                    <a:blip r:embed="rId19"/>
+                    <a:stretch>
+                      <a:fillRect/>
+                    </a:stretch>
+                  </pic:blipFill>
+                  <pic:spPr>
+                    <a:xfrm>
+                      <a:off x="0" y="0"/>
+                      <a:ext cx="5486400" cy="2746091"/>
+                    </a:xfrm>
+                    <a:prstGeom prst="rect"/>
+                  </pic:spPr>
+                </pic:pic>
+              </a:graphicData>
+            </a:graphic>
+          </wp:inline>
+        </w:drawing>
+      </w:r>
+    </w:p>
+    <w:p>
+      <w:pPr>
+        <w:jc w:val="center"/>
+      </w:pPr>
       <w:r>
         <w:rPr>
           <w:i/>
-          <w:color w:val="888888"/>
+          <w:sz w:val="18"/>
         </w:rPr>
-        <w:t>[Screenshot pending: mlflow_best_run.png]</w:t>
+        <w:t>Screenshot: mlflow_best_run.png</w:t>
       </w:r>
     </w:p>
     <w:p>
+      <w:pPr>
+        <w:jc w:val="center"/>
+      </w:pPr>
+      <w:r>
+        <w:drawing>
+          <wp:inline xmlns:a="http://schemas.openxmlformats.org/drawingml/2006/main" xmlns:pic="http://schemas.openxmlformats.org/drawingml/2006/picture">
+            <wp:extent cx="5486400" cy="1576187"/>
+            <wp:docPr id="12" name="Picture 12"/>
+            <wp:cNvGraphicFramePr>
+              <a:graphicFrameLocks noChangeAspect="1"/>
+            </wp:cNvGraphicFramePr>
+            <a:graphic>
+              <a:graphicData uri="http://schemas.openxmlformats.org/drawingml/2006/picture">
+                <pic:pic>
+                  <pic:nvPicPr>
+                    <pic:cNvPr id="0" name="mlflow_model_registry.png"/>
+                    <pic:cNvPicPr/>
+                  </pic:nvPicPr>
+                  <pic:blipFill>
+                    <a:blip r:embed="rId20"/>
+                    <a:stretch>
+                      <a:fillRect/>
+                    </a:stretch>
+                  </pic:blipFill>
+                  <pic:spPr>
+                    <a:xfrm>
+                      <a:off x="0" y="0"/>
+                      <a:ext cx="5486400" cy="1576187"/>
+                    </a:xfrm>
+                    <a:prstGeom prst="rect"/>
+                  </pic:spPr>
+                </pic:pic>
+              </a:graphicData>
+            </a:graphic>
+          </wp:inline>
+        </w:drawing>
+      </w:r>
+    </w:p>
+    <w:p>
+      <w:pPr>
+        <w:jc w:val="center"/>
+      </w:pPr>
       <w:r>
         <w:rPr>
           <w:i/>
-          <w:color w:val="888888"/>
+          <w:sz w:val="18"/>
         </w:rPr>
-        <w:t>[Screenshot pending: mlflow_model_registry.png]</w:t>
+        <w:t>Screenshot: mlflow_model_registry.png</w:t>
       </w:r>
     </w:p>
     <w:p>
@@ -7207,7 +7456,7 @@
         <w:drawing>
           <wp:inline xmlns:a="http://schemas.openxmlformats.org/drawingml/2006/main" xmlns:pic="http://schemas.openxmlformats.org/drawingml/2006/picture">
             <wp:extent cx="5486400" cy="1770077"/>
-            <wp:docPr id="9" name="Picture 9"/>
+            <wp:docPr id="13" name="Picture 13"/>
             <wp:cNvGraphicFramePr>
               <a:graphicFrameLocks noChangeAspect="1"/>
             </wp:cNvGraphicFramePr>
@@ -7219,7 +7468,7 @@
                     <pic:cNvPicPr/>
                   </pic:nvPicPr>
                   <pic:blipFill>
-                    <a:blip r:embed="rId17"/>
+                    <a:blip r:embed="rId21"/>
                     <a:stretch>
                       <a:fillRect/>
                     </a:stretch>

</xml_diff>